<commit_message>
registry v1.33: Stone BC staged (SM-067) - does the 4-cube anomaly recur on the 8-cube? brief locked, NEXT_MAP for a fresh window; v1.0 rebuilt with the stale sec 7.9.5 phrase corrected (reason is sec 7.12.4)
Co-Authored-By: Claude Fable 5.1 <noreply@anthropic.com>
</commit_message>
<xml_diff>
--- a/joint_paper/Roof_and_Clock_v1.0.docx
+++ b/joint_paper/Roof_and_Clock_v1.0.docx
@@ -16907,13 +16907,13 @@
         <w:t xml:space="preserve"> </w:t>
       </w:r>
       <w:r>
-        <w:t xml:space="preserve">Spin(10) — is the one board in the family that shares more, for a</w:t>
-      </w:r>
-      <w:r>
-        <w:t xml:space="preserve"> </w:t>
-      </w:r>
-      <w:r>
-        <w:t xml:space="preserve">reason not yet found.</w:t>
+        <w:t xml:space="preserve">Spin(10) — is the one board in the family that shares more; the</w:t>
+      </w:r>
+      <w:r>
+        <w:t xml:space="preserve"> </w:t>
+      </w:r>
+      <w:r>
+        <w:t xml:space="preserve">mechanism is given in §7.12.2 and the reason in §7.12.4.</w:t>
       </w:r>
     </w:p>
     <w:bookmarkEnd w:id="33"/>

</xml_diff>

<commit_message>
registry v1.39: Stone BF executed and sealed (SM-070) - WHY FOUR, the commutation theorem: w_n = -(e2e3)(e4e5)...(e_{n-2}e_{n-1}) commutes with the half-turn R^n iff n = 4 (n even); rowmotion on the shifted staircase in excess coordinates (Lemma BF-A), the orbit of lambda in closed form for all n (the +-n/2 shift now a theorem for all even n), w_n commutes on the orbit of lambda and on carrying orbits (all of B4), e_2 a witness for n >= 6 via H(e_2) and H({3,n}) in closed form; 8 PASS + 0 FAIL; papers v1.0 and v2.0 rebuilt (Lemma 6.12, Prop 6.13, Thm 6.14)
Co-Authored-By: Claude Fable 5.1 <noreply@anthropic.com>
</commit_message>
<xml_diff>
--- a/joint_paper/Roof_and_Clock_v1.0.docx
+++ b/joint_paper/Roof_and_Clock_v1.0.docx
@@ -20562,13 +20562,157 @@
         <w:t xml:space="preserve"> </w:t>
       </w:r>
       <w:r>
-        <w:t xml:space="preserve">|I₁₆| itself is not decided. Open, sharpened: why does −(e₂e₃)(e₄e₅)… commute</w:t>
-      </w:r>
-      <w:r>
-        <w:t xml:space="preserve"> </w:t>
-      </w:r>
-      <w:r>
-        <w:t xml:space="preserve">with the half-turn only at n = 4.</w:t>
+        <w:t xml:space="preserve">|I₁₆| itself is not decided.</w:t>
+      </w:r>
+    </w:p>
+    <w:p>
+      <w:pPr>
+        <w:pStyle w:val="BodyText"/>
+      </w:pPr>
+      <w:r>
+        <w:rPr>
+          <w:b/>
+          <w:bCs/>
+        </w:rPr>
+        <w:t xml:space="preserve">Why four — the commutation theorem [P, SM-070].</w:t>
+      </w:r>
+      <w:r>
+        <w:t xml:space="preserve"> </w:t>
+      </w:r>
+      <w:r>
+        <w:t xml:space="preserve">For even n ≥ 4 the</w:t>
+      </w:r>
+      <w:r>
+        <w:t xml:space="preserve"> </w:t>
+      </w:r>
+      <w:r>
+        <w:t xml:space="preserve">element w_n = −(e₂e₃)(e₄e₅)…(e_{n−2}e_{n−1}) commutes with the half-turn Rⁿ</w:t>
+      </w:r>
+      <w:r>
+        <w:t xml:space="preserve"> </w:t>
+      </w:r>
+      <w:r>
+        <w:t xml:space="preserve">if and only if n = 4. The proof rests on a one-line recursion for rowmotion on</w:t>
+      </w:r>
+      <w:r>
+        <w:t xml:space="preserve"> </w:t>
+      </w:r>
+      <w:r>
+        <w:t xml:space="preserve">the shifted staircase in</w:t>
+      </w:r>
+      <w:r>
+        <w:t xml:space="preserve"> </w:t>
+      </w:r>
+      <w:r>
+        <w:t xml:space="preserve">“excess”</w:t>
+      </w:r>
+      <w:r>
+        <w:t xml:space="preserve"> </w:t>
+      </w:r>
+      <w:r>
+        <w:t xml:space="preserve">coordinates d_k = c_k − k (c_k the plus</w:t>
+      </w:r>
+      <w:r>
+        <w:t xml:space="preserve"> </w:t>
+      </w:r>
+      <w:r>
+        <w:t xml:space="preserve">positions), from which the orbit of λ is written in closed form for every n:</w:t>
+      </w:r>
+      <w:r>
+        <w:t xml:space="preserve"> </w:t>
+      </w:r>
+      <w:r>
+        <w:t xml:space="preserve">R^{2j}λ = [n] ∖ {n, n−2, …, n−2j+2}, R^{2j+1}λ = [n] ∖ {n−1, …, n−2j+1}, ranks</w:t>
+      </w:r>
+      <w:r>
+        <w:t xml:space="preserve"> </w:t>
+      </w:r>
+      <w:r>
+        <w:t xml:space="preserve">0, n, n−1, n−1, …, 1, 1 around the clock — so the half-turn shifts every rank</w:t>
+      </w:r>
+      <w:r>
+        <w:t xml:space="preserve"> </w:t>
+      </w:r>
+      <w:r>
+        <w:t xml:space="preserve">on the full-height orbit by exactly ±n/2 for every even n, and the hypothesis</w:t>
+      </w:r>
+      <w:r>
+        <w:t xml:space="preserve"> </w:t>
+      </w:r>
+      <w:r>
+        <w:t xml:space="preserve">of the rank-shift theorem above is now proved for all n rather than verified</w:t>
+      </w:r>
+      <w:r>
+        <w:t xml:space="preserve"> </w:t>
+      </w:r>
+      <w:r>
+        <w:t xml:space="preserve">at 4, 8 and 16. On that orbit w_n acts by i ↦ 2 − i (even clock positions)</w:t>
+      </w:r>
+      <w:r>
+        <w:t xml:space="preserve"> </w:t>
+      </w:r>
+      <w:r>
+        <w:t xml:space="preserve">and i ↦ −i (odd), both commuting with i ↦ i + n; on a carrying orbit</w:t>
+      </w:r>
+      <w:r>
+        <w:t xml:space="preserve"> </w:t>
+      </w:r>
+      <w:r>
+        <w:t xml:space="preserve">commutation is automatic (wHx = x = Hwx). At n = 4 those two orbits are the</w:t>
+      </w:r>
+      <w:r>
+        <w:t xml:space="preserve"> </w:t>
+      </w:r>
+      <w:r>
+        <w:t xml:space="preserve">whole board, which is why −τ commutes with R⁴. For even n ≥ 6 the point e₂</w:t>
+      </w:r>
+      <w:r>
+        <w:t xml:space="preserve"> </w:t>
+      </w:r>
+      <w:r>
+        <w:t xml:space="preserve">(one minus sign, at position 2) is a witness: the closed forms</w:t>
+      </w:r>
+      <w:r>
+        <w:t xml:space="preserve"> </w:t>
+      </w:r>
+      <w:r>
+        <w:t xml:space="preserve">Rⁿ(e₂) = {1, 2} ∪ {5, 7, …, n−1} and Rⁿ({3, n}) = [n] ∖ {4, 6, 7, 9, …, n−1}</w:t>
+      </w:r>
+      <w:r>
+        <w:t xml:space="preserve"> </w:t>
+      </w:r>
+      <w:r>
+        <w:t xml:space="preserve">(both by induction along the orbit in excess coordinates) give 2 ∈ w_n Rⁿ e₂</w:t>
+      </w:r>
+      <w:r>
+        <w:t xml:space="preserve"> </w:t>
+      </w:r>
+      <w:r>
+        <w:t xml:space="preserve">but 2 ∉ Rⁿ w_n e₂, since w_n e₂ = −{3, n}. Together with the criterion this</w:t>
+      </w:r>
+      <w:r>
+        <w:t xml:space="preserve"> </w:t>
+      </w:r>
+      <w:r>
+        <w:t xml:space="preserve">is the reason for the 4-cube: the mechanism is present on every free clock;</w:t>
+      </w:r>
+      <w:r>
+        <w:t xml:space="preserve"> </w:t>
+      </w:r>
+      <w:r>
+        <w:t xml:space="preserve">its consequence needs a commutation that only the smallest board allows. Still</w:t>
+      </w:r>
+      <w:r>
+        <w:t xml:space="preserve"> </w:t>
+      </w:r>
+      <w:r>
+        <w:t xml:space="preserve">open: that w_n is the nearest Weyl element for n &gt; 8, and C_W(Rⁿ) = {±1} in</w:t>
+      </w:r>
+      <w:r>
+        <w:t xml:space="preserve"> </w:t>
+      </w:r>
+      <w:r>
+        <w:t xml:space="preserve">general.</w:t>
       </w:r>
     </w:p>
     <w:bookmarkEnd w:id="48"/>
@@ -27173,25 +27317,31 @@
         <w:t xml:space="preserve"> </w:t>
       </w:r>
       <w:r>
-        <w:t xml:space="preserve">inverted), SM-068 (Stone BD, 7 + 3), SM-069 (Stone BE, 9 + 2) — the 8-cube,</w:t>
-      </w:r>
-      <w:r>
-        <w:t xml:space="preserve"> </w:t>
-      </w:r>
-      <w:r>
-        <w:t xml:space="preserve">the criterion and the 16-cube, prepared on the Stenberg side under briefs</w:t>
-      </w:r>
-      <w:r>
-        <w:t xml:space="preserve"> </w:t>
-      </w:r>
-      <w:r>
-        <w:t xml:space="preserve">locked before code; the second author’s re-execution is invited. They are the</w:t>
-      </w:r>
-      <w:r>
-        <w:t xml:space="preserve"> </w:t>
-      </w:r>
-      <w:r>
-        <w:t xml:space="preserve">three units cited in this paper that are not yet JOINT.</w:t>
+        <w:t xml:space="preserve">inverted), SM-068 (Stone BD, 7 + 3), SM-069 (Stone BE, 9 + 2), SM-070 (Stone</w:t>
+      </w:r>
+      <w:r>
+        <w:t xml:space="preserve"> </w:t>
+      </w:r>
+      <w:r>
+        <w:t xml:space="preserve">BF, 8/8) — the 8-cube, the criterion, the 16-cube and the commutation theorem,</w:t>
+      </w:r>
+      <w:r>
+        <w:t xml:space="preserve"> </w:t>
+      </w:r>
+      <w:r>
+        <w:t xml:space="preserve">prepared on the Stenberg side under briefs locked before code; the second</w:t>
+      </w:r>
+      <w:r>
+        <w:t xml:space="preserve"> </w:t>
+      </w:r>
+      <w:r>
+        <w:t xml:space="preserve">author’s re-execution is invited. They are the four units cited in this paper</w:t>
+      </w:r>
+      <w:r>
+        <w:t xml:space="preserve"> </w:t>
+      </w:r>
+      <w:r>
+        <w:t xml:space="preserve">that are not yet JOINT.</w:t>
       </w:r>
     </w:p>
     <w:bookmarkEnd w:id="75"/>

</xml_diff>

<commit_message>
registry v1.45 (entry): Ilya's word received - SM-067..070 JOINT, publication word on the audited v2.0; all seventy units JOINT; record edition Appendix A updated (previous commit carried the message without the entry)
Co-Authored-By: Claude Fable 5.1 <noreply@anthropic.com>
</commit_message>
<xml_diff>
--- a/joint_paper/Roof_and_Clock_v1.0.docx
+++ b/joint_paper/Roof_and_Clock_v1.0.docx
@@ -27347,19 +27347,19 @@
         <w:t xml:space="preserve"> </w:t>
       </w:r>
       <w:r>
-        <w:t xml:space="preserve">prepared on the Stenberg side under briefs locked before code; the second</w:t>
-      </w:r>
-      <w:r>
-        <w:t xml:space="preserve"> </w:t>
-      </w:r>
-      <w:r>
-        <w:t xml:space="preserve">author’s re-execution is invited. They are the four units cited in this paper</w:t>
-      </w:r>
-      <w:r>
-        <w:t xml:space="preserve"> </w:t>
-      </w:r>
-      <w:r>
-        <w:t xml:space="preserve">that are not yet JOINT.</w:t>
+        <w:t xml:space="preserve">prepared on the Stenberg side under briefs locked before code — JOINT on the</w:t>
+      </w:r>
+      <w:r>
+        <w:t xml:space="preserve"> </w:t>
+      </w:r>
+      <w:r>
+        <w:t xml:space="preserve">second author’s word of 2026-09-20, given on the audited mathematics edition.</w:t>
+      </w:r>
+      <w:r>
+        <w:t xml:space="preserve"> </w:t>
+      </w:r>
+      <w:r>
+        <w:t xml:space="preserve">Every unit cited in this paper is JOINT.</w:t>
       </w:r>
     </w:p>
     <w:bookmarkEnd w:id="75"/>

</xml_diff>